<commit_message>
Merge remote and local changes
</commit_message>
<xml_diff>
--- a/Creating git account and adding documents.docx
+++ b/Creating git account and adding documents.docx
@@ -14,8 +14,6 @@
           <w:lang w:val="en-US"/>
         </w:rPr>
       </w:pPr>
-      <w:bookmarkStart w:id="0" w:name="_GoBack"/>
-      <w:bookmarkEnd w:id="0"/>
       <w:r>
         <w:rPr>
           <w:rFonts w:hint="default"/>
@@ -441,8 +439,8 @@
       <w:r>
         <w:drawing>
           <wp:inline distT="0" distB="0" distL="114300" distR="114300">
-            <wp:extent cx="4875530" cy="561975"/>
-            <wp:effectExtent l="0" t="0" r="1270" b="9525"/>
+            <wp:extent cx="5266055" cy="666115"/>
+            <wp:effectExtent l="0" t="0" r="10795" b="635"/>
             <wp:docPr id="3" name="Picture 3"/>
             <wp:cNvGraphicFramePr>
               <a:graphicFrameLocks xmlns:a="http://schemas.openxmlformats.org/drawingml/2006/main" noChangeAspect="1"/>
@@ -465,7 +463,7 @@
                   <pic:spPr>
                     <a:xfrm>
                       <a:off x="0" y="0"/>
-                      <a:ext cx="4875530" cy="561975"/>
+                      <a:ext cx="5266055" cy="666115"/>
                     </a:xfrm>
                     <a:prstGeom prst="rect">
                       <a:avLst/>
@@ -522,11 +520,12 @@
       </w:pPr>
     </w:p>
     <w:p>
+      <w:bookmarkStart w:id="0" w:name="_GoBack"/>
       <w:r>
         <w:drawing>
           <wp:inline distT="0" distB="0" distL="114300" distR="114300">
-            <wp:extent cx="4837430" cy="676275"/>
-            <wp:effectExtent l="0" t="0" r="1270" b="9525"/>
+            <wp:extent cx="5455285" cy="676275"/>
+            <wp:effectExtent l="0" t="0" r="12065" b="9525"/>
             <wp:docPr id="4" name="Picture 4"/>
             <wp:cNvGraphicFramePr>
               <a:graphicFrameLocks xmlns:a="http://schemas.openxmlformats.org/drawingml/2006/main" noChangeAspect="1"/>
@@ -549,7 +548,7 @@
                   <pic:spPr>
                     <a:xfrm>
                       <a:off x="0" y="0"/>
-                      <a:ext cx="4837430" cy="676275"/>
+                      <a:ext cx="5455285" cy="676275"/>
                     </a:xfrm>
                     <a:prstGeom prst="rect">
                       <a:avLst/>
@@ -565,6 +564,7 @@
           </wp:inline>
         </w:drawing>
       </w:r>
+      <w:bookmarkEnd w:id="0"/>
     </w:p>
     <w:p/>
     <w:p/>
@@ -605,8 +605,8 @@
       <w:r>
         <w:drawing>
           <wp:inline distT="0" distB="0" distL="114300" distR="114300">
-            <wp:extent cx="4799965" cy="1638300"/>
-            <wp:effectExtent l="0" t="0" r="635" b="0"/>
+            <wp:extent cx="5437505" cy="1638300"/>
+            <wp:effectExtent l="0" t="0" r="10795" b="0"/>
             <wp:docPr id="5" name="Picture 5"/>
             <wp:cNvGraphicFramePr>
               <a:graphicFrameLocks xmlns:a="http://schemas.openxmlformats.org/drawingml/2006/main" noChangeAspect="1"/>
@@ -629,7 +629,7 @@
                   <pic:spPr>
                     <a:xfrm>
                       <a:off x="0" y="0"/>
-                      <a:ext cx="4799965" cy="1638300"/>
+                      <a:ext cx="5437505" cy="1638300"/>
                     </a:xfrm>
                     <a:prstGeom prst="rect">
                       <a:avLst/>
@@ -684,8 +684,8 @@
       <w:r>
         <w:drawing>
           <wp:inline distT="0" distB="0" distL="114300" distR="114300">
-            <wp:extent cx="5271770" cy="979805"/>
-            <wp:effectExtent l="0" t="0" r="5080" b="10795"/>
+            <wp:extent cx="5414010" cy="979805"/>
+            <wp:effectExtent l="0" t="0" r="15240" b="10795"/>
             <wp:docPr id="6" name="Picture 6"/>
             <wp:cNvGraphicFramePr>
               <a:graphicFrameLocks xmlns:a="http://schemas.openxmlformats.org/drawingml/2006/main" noChangeAspect="1"/>
@@ -708,7 +708,7 @@
                   <pic:spPr>
                     <a:xfrm>
                       <a:off x="0" y="0"/>
-                      <a:ext cx="5271770" cy="979805"/>
+                      <a:ext cx="5414010" cy="979805"/>
                     </a:xfrm>
                     <a:prstGeom prst="rect">
                       <a:avLst/>

</xml_diff>